<commit_message>
docs(phase): user story update
</commit_message>
<xml_diff>
--- a/Historia_Usuario_Gestion_Hotel original.docx
+++ b/Historia_Usuario_Gestion_Hotel original.docx
@@ -86,6 +86,30 @@
     </w:p>
     <w:p>
       <w:pPr>
+        <w:spacing w:after="0" w:line="240" w:lineRule="auto"/>
+        <w:ind w:firstLine="720"/>
+        <w:jc w:val="center"/>
+        <w:rPr>
+          <w:rFonts w:asciiTheme="majorHAnsi" w:eastAsia="Calibri" w:hAnsiTheme="majorHAnsi" w:cstheme="majorHAnsi"/>
+          <w:b/>
+          <w:bCs/>
+          <w:sz w:val="24"/>
+          <w:szCs w:val="24"/>
+        </w:rPr>
+      </w:pPr>
+      <w:r>
+        <w:rPr>
+          <w:rFonts w:asciiTheme="majorHAnsi" w:eastAsia="Calibri" w:hAnsiTheme="majorHAnsi" w:cstheme="majorHAnsi"/>
+          <w:b/>
+          <w:bCs/>
+          <w:sz w:val="24"/>
+          <w:szCs w:val="24"/>
+        </w:rPr>
+        <w:t>Johan Andres Liñan Esquivel C.C 1025520586</w:t>
+      </w:r>
+    </w:p>
+    <w:p>
+      <w:pPr>
         <w:pStyle w:val="Ttulo1"/>
         <w:rPr>
           <w:rFonts w:eastAsiaTheme="minorEastAsia" w:cstheme="majorHAnsi"/>
@@ -97,8 +121,53 @@
       </w:pPr>
     </w:p>
     <w:p/>
-    <w:p/>
-    <w:p/>
+    <w:p>
+      <w:pPr>
+        <w:jc w:val="center"/>
+      </w:pPr>
+      <w:r>
+        <w:rPr>
+          <w:rFonts w:ascii="Calibri" w:eastAsia="Calibri" w:hAnsi="Calibri" w:cs="Calibri"/>
+          <w:sz w:val="24"/>
+          <w:szCs w:val="24"/>
+        </w:rPr>
+        <w:drawing>
+          <wp:inline distT="0" distB="0" distL="0" distR="0" wp14:anchorId="695942C5" wp14:editId="20636C71">
+            <wp:extent cx="847090" cy="828675"/>
+            <wp:effectExtent l="0" t="0" r="0" b="0"/>
+            <wp:docPr id="1" name="image1.png"/>
+            <wp:cNvGraphicFramePr/>
+            <a:graphic xmlns:a="http://schemas.openxmlformats.org/drawingml/2006/main">
+              <a:graphicData uri="http://schemas.openxmlformats.org/drawingml/2006/picture">
+                <pic:pic xmlns:pic="http://schemas.openxmlformats.org/drawingml/2006/picture">
+                  <pic:nvPicPr>
+                    <pic:cNvPr id="0" name="image1.png"/>
+                    <pic:cNvPicPr preferRelativeResize="0"/>
+                  </pic:nvPicPr>
+                  <pic:blipFill>
+                    <a:blip r:embed="rId8"/>
+                    <a:srcRect l="-16" t="-17" r="-15" b="-17"/>
+                    <a:stretch>
+                      <a:fillRect/>
+                    </a:stretch>
+                  </pic:blipFill>
+                  <pic:spPr>
+                    <a:xfrm>
+                      <a:off x="0" y="0"/>
+                      <a:ext cx="847090" cy="828675"/>
+                    </a:xfrm>
+                    <a:prstGeom prst="rect">
+                      <a:avLst/>
+                    </a:prstGeom>
+                    <a:ln/>
+                  </pic:spPr>
+                </pic:pic>
+              </a:graphicData>
+            </a:graphic>
+          </wp:inline>
+        </w:drawing>
+      </w:r>
+    </w:p>
     <w:p/>
     <w:p/>
     <w:p>
@@ -1000,6 +1069,7 @@
           <w:rFonts w:asciiTheme="majorHAnsi" w:hAnsiTheme="majorHAnsi" w:cstheme="majorHAnsi"/>
           <w:sz w:val="24"/>
           <w:szCs w:val="24"/>
+          <w:lang w:val="en-US"/>
         </w:rPr>
       </w:pPr>
       <w:r>
@@ -1008,6 +1078,7 @@
           <w:b/>
           <w:sz w:val="24"/>
           <w:szCs w:val="24"/>
+          <w:lang w:val="en-US"/>
         </w:rPr>
         <w:t xml:space="preserve">Sprint 1 — Base del sistema: </w:t>
       </w:r>
@@ -1016,6 +1087,7 @@
           <w:rFonts w:asciiTheme="majorHAnsi" w:hAnsiTheme="majorHAnsi" w:cstheme="majorHAnsi"/>
           <w:sz w:val="24"/>
           <w:szCs w:val="24"/>
+          <w:lang w:val="en-US"/>
         </w:rPr>
         <w:t>HU-01 Must, HU-04 Must, HU-05 Must, HU-08 Must</w:t>
       </w:r>
@@ -1026,6 +1098,7 @@
           <w:rFonts w:asciiTheme="majorHAnsi" w:hAnsiTheme="majorHAnsi" w:cstheme="majorHAnsi"/>
           <w:sz w:val="24"/>
           <w:szCs w:val="24"/>
+          <w:lang w:val="en-US"/>
         </w:rPr>
       </w:pPr>
       <w:r>
@@ -1034,6 +1107,7 @@
           <w:b/>
           <w:sz w:val="24"/>
           <w:szCs w:val="24"/>
+          <w:lang w:val="en-US"/>
         </w:rPr>
         <w:t xml:space="preserve">Sprint 2 — Reservas y disponibilidad: </w:t>
       </w:r>
@@ -1042,6 +1116,7 @@
           <w:rFonts w:asciiTheme="majorHAnsi" w:hAnsiTheme="majorHAnsi" w:cstheme="majorHAnsi"/>
           <w:sz w:val="24"/>
           <w:szCs w:val="24"/>
+          <w:lang w:val="en-US"/>
         </w:rPr>
         <w:t>HU-09 Must, HU-11 Must, HU-10 Should</w:t>
       </w:r>
@@ -1078,6 +1153,7 @@
           <w:rFonts w:asciiTheme="majorHAnsi" w:hAnsiTheme="majorHAnsi" w:cstheme="majorHAnsi"/>
           <w:sz w:val="24"/>
           <w:szCs w:val="24"/>
+          <w:lang w:val="en-US"/>
         </w:rPr>
       </w:pPr>
       <w:r>
@@ -1086,6 +1162,7 @@
           <w:b/>
           <w:sz w:val="24"/>
           <w:szCs w:val="24"/>
+          <w:lang w:val="en-US"/>
         </w:rPr>
         <w:t xml:space="preserve">Sprint 4 — Mantenimiento de datos: </w:t>
       </w:r>
@@ -1094,6 +1171,7 @@
           <w:rFonts w:asciiTheme="majorHAnsi" w:hAnsiTheme="majorHAnsi" w:cstheme="majorHAnsi"/>
           <w:sz w:val="24"/>
           <w:szCs w:val="24"/>
+          <w:lang w:val="en-US"/>
         </w:rPr>
         <w:t>HU-02 Should, HU-06 Should, HU-03 Could, HU-07 Could</w:t>
       </w:r>
@@ -7811,7 +7889,7 @@
       </w:pPr>
     </w:p>
     <w:sectPr>
-      <w:footerReference w:type="default" r:id="rId8"/>
+      <w:footerReference w:type="default" r:id="rId9"/>
       <w:pgSz w:w="12240" w:h="15840"/>
       <w:pgMar w:top="936" w:right="1080" w:bottom="936" w:left="1080" w:header="720" w:footer="720" w:gutter="0"/>
       <w:cols w:space="720"/>

</xml_diff>